<commit_message>
function check and upgrade
</commit_message>
<xml_diff>
--- a/files/marked/IS-001 資訊安全政策.docx
+++ b/files/marked/IS-001 資訊安全政策.docx
@@ -2185,84 +2185,7 @@
         </w:rPr>
       </w:pPr>
       <w:r>
-        <w:rPr>
-          <w:rFonts w:hAnsi="新細明體" w:hint="eastAsia"/>
-          <w:szCs w:val="28"/>
-        </w:rPr>
-        <w:t>考量</w:t>
-      </w:r>
-      <w:r>
-        <w:rPr>
-          <w:rFonts w:hAnsi="新細明體" w:hint="eastAsia"/>
-          <w:szCs w:val="28"/>
-          <w:shd w:val="clear" w:color="auto" w:fill="D9D9D9"/>
-        </w:rPr>
-        <w:t>公司</w:t>
-      </w:r>
-      <w:r>
-        <w:rPr>
-          <w:rFonts w:hAnsi="新細明體" w:hint="eastAsia"/>
-          <w:szCs w:val="28"/>
-        </w:rPr>
-        <w:t>之</w:t>
-      </w:r>
-      <w:r>
-        <w:rPr>
-          <w:rFonts w:hAnsi="新細明體" w:hint="eastAsia"/>
-          <w:szCs w:val="28"/>
-          <w:shd w:val="clear" w:color="auto" w:fill="D9D9D9"/>
-        </w:rPr>
-        <w:t>核心資訊系統</w:t>
-      </w:r>
-      <w:r>
-        <w:rPr>
-          <w:rFonts w:hAnsi="新細明體" w:hint="eastAsia"/>
-          <w:szCs w:val="28"/>
-        </w:rPr>
-        <w:t>及相關利害關係者之需求及期望，基於</w:t>
-      </w:r>
-      <w:r>
-        <w:rPr>
-          <w:rFonts w:hAnsi="新細明體" w:hint="eastAsia"/>
-          <w:szCs w:val="28"/>
-        </w:rPr>
-        <w:t>保護資訊資產機密性、完整性、可用性為目標，將</w:t>
-      </w:r>
-      <w:r>
-        <w:rPr>
-          <w:rFonts w:hint="eastAsia"/>
-          <w:color w:val="000000"/>
-          <w:highlight w:val="yellow"/>
-        </w:rPr>
-        <w:t>軟體開發、測試、雲端應用服務維運及實體環境安全管理作業涵蓋電子發票應用程式介面之軟體產品及加值衍生著作之資訊業務活動</w:t>
-      </w:r>
-      <w:r>
-        <w:rPr>
-          <w:rFonts w:hAnsi="新細明體" w:hint="eastAsia"/>
-          <w:szCs w:val="28"/>
-        </w:rPr>
-        <w:t>優先納入資訊安全管理範圍，展現</w:t>
-      </w:r>
-      <w:r>
-        <w:rPr>
-          <w:rFonts w:hAnsi="新細明體" w:hint="eastAsia"/>
-          <w:szCs w:val="28"/>
-        </w:rPr>
-        <w:t>本公司永續發展</w:t>
-      </w:r>
-      <w:r>
-        <w:rPr>
-          <w:rFonts w:hAnsi="新細明體" w:hint="eastAsia"/>
-          <w:szCs w:val="28"/>
-        </w:rPr>
-        <w:t>經營管理理念</w:t>
-      </w:r>
-      <w:r>
-        <w:rPr>
-          <w:rFonts w:hAnsi="新細明體" w:hint="eastAsia"/>
-          <w:szCs w:val="28"/>
-        </w:rPr>
-        <w:t>。</w:t>
+        <w:t>考量公司之核心資訊系統及相關利害關係者之需求及期望，基於保護資訊資產機密性、完整性、可用性為目標，將{{isms_scope}}優先納入資訊安全管理範圍，展現本公司永續發展經營管理理念。</w:t>
       </w:r>
     </w:p>
     <w:p>

</xml_diff>